<commit_message>
Configure learn.mantraai.cloud as canonical student URL and update MoU terms.
Point legacy hosts to the student subdomain, add app URL helpers, align Render CORS and Standard API plan, and refresh internship MoU pricing without revenue share.

Co-authored-by: Cursor <cursoragent@cursor.com>
</commit_message>
<xml_diff>
--- a/docs/MoU_Hindusthan_College_Foundation_Track.docx
+++ b/docs/MoU_Hindusthan_College_Foundation_Track.docx
@@ -11,7 +11,7 @@
           <w:noProof/>
         </w:rPr>
         <w:drawing>
-          <wp:inline distT="0" distB="0" distL="0" distR="0" wp14:anchorId="134500CE" wp14:editId="593C9070">
+          <wp:inline distT="0" distB="0" distL="0" distR="0" wp14:anchorId="19C436FB" wp14:editId="177DFED9">
             <wp:extent cx="777240" cy="777240"/>
             <wp:effectExtent l="0" t="0" r="0" b="0"/>
             <wp:docPr id="1" name="Picture 1"/>
@@ -103,37 +103,7 @@
         <w:rPr>
           <w:rFonts w:ascii="Calibri" w:hAnsi="Calibri"/>
         </w:rPr>
-        <w:t>Mantra.ai, represented by M</w:t>
-      </w:r>
-      <w:r>
-        <w:rPr>
-          <w:rFonts w:ascii="Calibri" w:hAnsi="Calibri"/>
-        </w:rPr>
-        <w:t xml:space="preserve">rs.Vinodhini </w:t>
-      </w:r>
-      <w:r>
-        <w:rPr>
-          <w:rFonts w:ascii="Calibri" w:hAnsi="Calibri"/>
-        </w:rPr>
-        <w:t>Y</w:t>
-      </w:r>
-      <w:r>
-        <w:rPr>
-          <w:rFonts w:ascii="Calibri" w:hAnsi="Calibri"/>
-        </w:rPr>
-        <w:t xml:space="preserve">, </w:t>
-      </w:r>
-      <w:r>
-        <w:rPr>
-          <w:rFonts w:ascii="Calibri" w:hAnsi="Calibri"/>
-        </w:rPr>
-        <w:t>Founder</w:t>
-      </w:r>
-      <w:r>
-        <w:rPr>
-          <w:rFonts w:ascii="Calibri" w:hAnsi="Calibri"/>
-        </w:rPr>
-        <w:t xml:space="preserve"> (hereinafter “Mantra.ai” or the “Service Provider”)</w:t>
+        <w:t>Mantra.ai, represented by Mr. Praveen Manoharan, CTO &amp; Technical Program Manager (hereinafter “Mantra.ai” or the “Service Provider”)</w:t>
       </w:r>
     </w:p>
     <w:p/>
@@ -151,57 +121,10 @@
         <w:rPr>
           <w:rFonts w:ascii="Calibri" w:hAnsi="Calibri"/>
         </w:rPr>
-        <w:t xml:space="preserve">Hindusthan College of Engineering (HiCE), an autonomous institution affiliated to Anna University, Chennai, approved by AICTE, </w:t>
-      </w:r>
-      <w:r>
-        <w:rPr>
-          <w:rFonts w:ascii="Calibri" w:hAnsi="Calibri"/>
-        </w:rPr>
-        <w:t>Ingur</w:t>
-      </w:r>
-      <w:r>
-        <w:rPr>
-          <w:rFonts w:ascii="Calibri" w:hAnsi="Calibri"/>
-        </w:rPr>
-        <w:t>,</w:t>
-      </w:r>
-      <w:r>
-        <w:rPr>
-          <w:rFonts w:ascii="Calibri" w:hAnsi="Calibri"/>
-        </w:rPr>
-        <w:t xml:space="preserve"> Perundurai, Erode - 638052</w:t>
-      </w:r>
-      <w:r>
-        <w:rPr>
-          <w:rFonts w:ascii="Calibri" w:hAnsi="Calibri"/>
-        </w:rPr>
-        <w:t xml:space="preserve"> Tamil Nadu, India, represented by </w:t>
-      </w:r>
-      <w:r>
-        <w:rPr>
-          <w:rFonts w:ascii="Calibri" w:hAnsi="Calibri"/>
-        </w:rPr>
-        <w:t>_________________________________</w:t>
-      </w:r>
-      <w:r>
-        <w:rPr>
-          <w:rFonts w:ascii="Calibri" w:hAnsi="Calibri"/>
-        </w:rPr>
-        <w:t>, Principal (hereinafter the “</w:t>
-      </w:r>
-      <w:r>
-        <w:rPr>
-          <w:rFonts w:ascii="Calibri" w:hAnsi="Calibri"/>
-        </w:rPr>
-        <w:t>Hindusthan College of Engineering (HiCE)</w:t>
-      </w:r>
-      <w:r>
-        <w:rPr>
-          <w:rFonts w:ascii="Calibri" w:hAnsi="Calibri"/>
-        </w:rPr>
-        <w:t>”)</w:t>
+        <w:t>Hindusthan College of Engineering and Technology (HiCET), an autonomous institution affiliated to Anna University, Chennai, approved by AICTE, having its campus at Valley Campus, Pollachi Highway, Othakkalmandapam, Coimbatore – 641032, Tamil Nadu, India, represented by Dr. J. Jaya, Principal (hereinafter the “College”)</w:t>
       </w:r>
     </w:p>
+    <w:p/>
     <w:p>
       <w:r>
         <w:rPr>
@@ -326,7 +249,8 @@
           </w:tcPr>
           <w:p>
             <w:r>
-              <w:t>Course Fee</w:t>
+              <w:lastRenderedPageBreak/>
+              <w:t>Standard Course Fee</w:t>
             </w:r>
           </w:p>
         </w:tc>
@@ -336,19 +260,29 @@
           </w:tcPr>
           <w:p>
             <w:r>
-              <w:t>₹3,999 per Student enrollment</w:t>
+              <w:t>₹3,999 per Student per enrollment</w:t>
             </w:r>
+          </w:p>
+        </w:tc>
+      </w:tr>
+      <w:tr>
+        <w:tc>
+          <w:tcPr>
+            <w:tcW w:w="4536" w:type="dxa"/>
+          </w:tcPr>
+          <w:p>
             <w:r>
-              <w:t xml:space="preserve"> – 2</w:t>
+              <w:t>Partner Course Fee</w:t>
             </w:r>
+          </w:p>
+        </w:tc>
+        <w:tc>
+          <w:tcPr>
+            <w:tcW w:w="4536" w:type="dxa"/>
+          </w:tcPr>
+          <w:p>
             <w:r>
-              <w:rPr>
-                <w:vertAlign w:val="superscript"/>
-              </w:rPr>
-              <w:t>nd</w:t>
-            </w:r>
-            <w:r>
-              <w:t xml:space="preserve"> Year</w:t>
+              <w:t>₹3,599 per Student (10% partnership discount)</w:t>
             </w:r>
           </w:p>
         </w:tc>
@@ -370,11 +304,7 @@
           </w:tcPr>
           <w:p>
             <w:r>
-              <w:t xml:space="preserve">Bonafide 2nd–4th year student (CSE, IT, ECE, </w:t>
-            </w:r>
-            <w:r>
-              <w:lastRenderedPageBreak/>
-              <w:t>AI/ML, MCA or as agreed)</w:t>
+              <w:t>Bonafide 2nd–4th year student (CSE, IT, AI/ML, MCA or as agreed)</w:t>
             </w:r>
           </w:p>
         </w:tc>
@@ -386,7 +316,6 @@
           </w:tcPr>
           <w:p>
             <w:r>
-              <w:lastRenderedPageBreak/>
               <w:t>Platform</w:t>
             </w:r>
           </w:p>
@@ -397,26 +326,9 @@
           </w:tcPr>
           <w:p>
             <w:r>
-              <w:t>Mantra AI Talent Accelerator</w:t>
-            </w:r>
-            <w:r>
-              <w:t xml:space="preserve"> Portal</w:t>
+              <w:t>Mantra.ai web app</w:t>
             </w:r>
           </w:p>
-        </w:tc>
-      </w:tr>
-      <w:tr>
-        <w:tc>
-          <w:tcPr>
-            <w:tcW w:w="4536" w:type="dxa"/>
-          </w:tcPr>
-          <w:p/>
-        </w:tc>
-        <w:tc>
-          <w:tcPr>
-            <w:tcW w:w="4536" w:type="dxa"/>
-          </w:tcPr>
-          <w:p/>
         </w:tc>
       </w:tr>
     </w:tbl>
@@ -450,30 +362,7 @@
         <w:rPr>
           <w:rFonts w:ascii="Calibri" w:hAnsi="Calibri"/>
         </w:rPr>
-        <w:t>College promotes Program, facilitates enrollment, and nominates TPO + faculty liaison.</w:t>
-      </w:r>
-    </w:p>
-    <w:p>
-      <w:pPr>
-        <w:pStyle w:val="ListBullet"/>
-      </w:pPr>
-      <w:r>
-        <w:rPr>
-          <w:rFonts w:ascii="Calibri" w:hAnsi="Calibri"/>
-        </w:rPr>
-        <w:t xml:space="preserve">Joint branding: “Hindusthan College of Engineering × </w:t>
-      </w:r>
-      <w:r>
-        <w:rPr>
-          <w:rFonts w:ascii="Calibri" w:hAnsi="Calibri"/>
-        </w:rPr>
-        <w:t>Mantra AI Talent Accelerator</w:t>
-      </w:r>
-      <w:r>
-        <w:rPr>
-          <w:rFonts w:ascii="Calibri" w:hAnsi="Calibri"/>
-        </w:rPr>
-        <w:t>”</w:t>
+        <w:t>Future collaboration (non-binding): The College has suggested an on-campus Incubation Center partnership. Mantra.ai intends to evaluate and plan such an initiative from October 2026, building on this Internship Program. Any Incubation Center arrangement shall be subject to a separate written agreement and is not covered by this MoU.</w:t>
       </w:r>
     </w:p>
     <w:p>
@@ -492,7 +381,7 @@
         <w:rPr>
           <w:rFonts w:ascii="Calibri" w:hAnsi="Calibri"/>
         </w:rPr>
-        <w:t>Duration: 10 intensive weeks · Level: Beginner Foundation</w:t>
+        <w:t>Duration: 10 intensive weeks (~6 months structured depth) · Level: Beginner Foundation</w:t>
       </w:r>
     </w:p>
     <w:p>
@@ -620,13 +509,7 @@
         <w:rPr>
           <w:rFonts w:ascii="Calibri" w:hAnsi="Calibri"/>
         </w:rPr>
-        <w:t>L</w:t>
-      </w:r>
-      <w:r>
-        <w:rPr>
-          <w:rFonts w:ascii="Calibri" w:hAnsi="Calibri"/>
-        </w:rPr>
-        <w:t>etter of Recommendation</w:t>
+        <w:t>Merit-based LoR eligibility</w:t>
       </w:r>
     </w:p>
     <w:p>
@@ -637,19 +520,7 @@
         <w:rPr>
           <w:rFonts w:ascii="Calibri" w:hAnsi="Calibri"/>
         </w:rPr>
-        <w:t xml:space="preserve">Top 5%: paid internship pathway </w:t>
-      </w:r>
-      <w:r>
-        <w:rPr>
-          <w:rFonts w:ascii="Calibri" w:hAnsi="Calibri"/>
-        </w:rPr>
-        <w:t xml:space="preserve">for 2 months </w:t>
-      </w:r>
-      <w:r>
-        <w:rPr>
-          <w:rFonts w:ascii="Calibri" w:hAnsi="Calibri"/>
-        </w:rPr>
-        <w:t>(performance-based)</w:t>
+        <w:t>Top 5%: internship pathway (performance-based)</w:t>
       </w:r>
     </w:p>
     <w:p>
@@ -702,19 +573,13 @@
         <w:rPr>
           <w:rFonts w:ascii="Calibri" w:hAnsi="Calibri"/>
         </w:rPr>
-        <w:t>Admin training,</w:t>
+        <w:t>K</w:t>
       </w:r>
       <w:r>
         <w:rPr>
           <w:rFonts w:ascii="Calibri" w:hAnsi="Calibri"/>
         </w:rPr>
-        <w:t xml:space="preserve"> </w:t>
-      </w:r>
-      <w:r>
-        <w:rPr>
-          <w:rFonts w:ascii="Calibri" w:hAnsi="Calibri"/>
-        </w:rPr>
-        <w:t>kickoff webinar</w:t>
+        <w:t>ickoff webinar</w:t>
       </w:r>
     </w:p>
     <w:p>
@@ -734,6 +599,7 @@
           <w:rFonts w:ascii="Calibri" w:hAnsi="Calibri"/>
           <w:b/>
         </w:rPr>
+        <w:lastRenderedPageBreak/>
         <w:t>College shall:</w:t>
       </w:r>
     </w:p>
@@ -756,19 +622,7 @@
         <w:rPr>
           <w:rFonts w:ascii="Calibri" w:hAnsi="Calibri"/>
         </w:rPr>
-        <w:t>Ensure the College Coordinator (TPO/Internship Coordinator) provides one official institutional email ID of the College (e.g., @hice.ac.in) for formal Program communication</w:t>
-      </w:r>
-    </w:p>
-    <w:p>
-      <w:pPr>
-        <w:pStyle w:val="ListBullet"/>
-      </w:pPr>
-      <w:r>
-        <w:rPr>
-          <w:rFonts w:ascii="Calibri" w:hAnsi="Calibri"/>
-        </w:rPr>
-        <w:lastRenderedPageBreak/>
-        <w:t>Promote to eligible students; facilitate enrollment/fees</w:t>
+        <w:t>Ensure the College Coordinator (TPO/Internship Coordinator) provides one official institutional email ID of the College (e.g., @hicet.ac.in) for formal Program communication</w:t>
       </w:r>
     </w:p>
     <w:p>
@@ -829,28 +683,7 @@
           <w:rFonts w:ascii="Calibri" w:hAnsi="Calibri"/>
           <w:b/>
         </w:rPr>
-        <w:t xml:space="preserve">Mantra.ai official communication email: </w:t>
-      </w:r>
-      <w:r>
-        <w:rPr>
-          <w:rFonts w:ascii="Calibri" w:hAnsi="Calibri"/>
-          <w:b/>
-        </w:rPr>
-        <w:t>admin</w:t>
-      </w:r>
-      <w:r>
-        <w:rPr>
-          <w:rFonts w:ascii="Calibri" w:hAnsi="Calibri"/>
-          <w:b/>
-        </w:rPr>
-        <w:t>@mantraai</w:t>
-      </w:r>
-      <w:r>
-        <w:rPr>
-          <w:rFonts w:ascii="Calibri" w:hAnsi="Calibri"/>
-          <w:b/>
-        </w:rPr>
-        <w:t>.cloud</w:t>
+        <w:t>Mantra.ai official communication email: _________________________________ @mantra.ai</w:t>
       </w:r>
     </w:p>
     <w:p>
@@ -886,27 +719,108 @@
           <w:rFonts w:ascii="Calibri" w:hAnsi="Calibri"/>
           <w:b/>
         </w:rPr>
-        <w:t>Course Fee: ₹3,999 per Student (all-inclusive as per Section 4).</w:t>
+        <w:t>Standard Course Fee: ₹3,999 per Student. Partner Course Fee: ₹3,599 per Student (10% partnership discount for College-attributed enrollments).</w:t>
       </w:r>
     </w:p>
     <w:p>
       <w:r>
         <w:rPr>
           <w:rFonts w:ascii="Calibri" w:hAnsi="Calibri"/>
+          <w:b/>
         </w:rPr>
-        <w:t>Payment: Students pay Mantra.ai directly</w:t>
+        <w:t>There is no revenue share or commission payable to the College under this MoU.</w:t>
+      </w:r>
+    </w:p>
+    <w:tbl>
+      <w:tblPr>
+        <w:tblStyle w:val="TableGrid"/>
+        <w:tblW w:w="0" w:type="auto"/>
+        <w:tblLook w:val="04A0" w:firstRow="1" w:lastRow="0" w:firstColumn="1" w:lastColumn="0" w:noHBand="0" w:noVBand="1"/>
+      </w:tblPr>
+      <w:tblGrid>
+        <w:gridCol w:w="4536"/>
+        <w:gridCol w:w="4536"/>
+      </w:tblGrid>
+      <w:tr>
+        <w:tc>
+          <w:tcPr>
+            <w:tcW w:w="4536" w:type="dxa"/>
+          </w:tcPr>
+          <w:p>
+            <w:r>
+              <w:t>Fee type</w:t>
+            </w:r>
+          </w:p>
+        </w:tc>
+        <w:tc>
+          <w:tcPr>
+            <w:tcW w:w="4536" w:type="dxa"/>
+          </w:tcPr>
+          <w:p>
+            <w:r>
+              <w:t>Amount (per enrollment)</w:t>
+            </w:r>
+          </w:p>
+        </w:tc>
+      </w:tr>
+      <w:tr>
+        <w:tc>
+          <w:tcPr>
+            <w:tcW w:w="4536" w:type="dxa"/>
+          </w:tcPr>
+          <w:p>
+            <w:r>
+              <w:t>Standard Course Fee</w:t>
+            </w:r>
+          </w:p>
+        </w:tc>
+        <w:tc>
+          <w:tcPr>
+            <w:tcW w:w="4536" w:type="dxa"/>
+          </w:tcPr>
+          <w:p>
+            <w:r>
+              <w:t>₹3,999</w:t>
+            </w:r>
+          </w:p>
+        </w:tc>
+      </w:tr>
+      <w:tr>
+        <w:tc>
+          <w:tcPr>
+            <w:tcW w:w="4536" w:type="dxa"/>
+          </w:tcPr>
+          <w:p>
+            <w:r>
+              <w:t>Partner Course Fee (10% discount)</w:t>
+            </w:r>
+          </w:p>
+        </w:tc>
+        <w:tc>
+          <w:tcPr>
+            <w:tcW w:w="4536" w:type="dxa"/>
+          </w:tcPr>
+          <w:p>
+            <w:r>
+              <w:t>₹3,599</w:t>
+            </w:r>
+          </w:p>
+        </w:tc>
+      </w:tr>
+    </w:tbl>
+    <w:p/>
+    <w:p>
+      <w:r>
+        <w:rPr>
+          <w:rFonts w:ascii="Calibri" w:hAnsi="Calibri"/>
+        </w:rPr>
+        <w:t>Payment: Students pay Mantra.ai directly at ₹3,599</w:t>
       </w:r>
       <w:r>
         <w:rPr>
           <w:rFonts w:ascii="Calibri" w:hAnsi="Calibri"/>
         </w:rPr>
         <w:t>.</w:t>
-      </w:r>
-      <w:r>
-        <w:rPr>
-          <w:rFonts w:ascii="Calibri" w:hAnsi="Calibri"/>
-        </w:rPr>
-        <w:t xml:space="preserve"> </w:t>
       </w:r>
     </w:p>
     <w:p>
@@ -1022,7 +936,10 @@
           </w:tcPr>
           <w:p>
             <w:r>
-              <w:t>Admin training, kickoff webinar</w:t>
+              <w:t>K</w:t>
+            </w:r>
+            <w:r>
+              <w:t>ickoff webinar</w:t>
             </w:r>
           </w:p>
         </w:tc>
@@ -1100,6 +1017,7 @@
         <w:rPr>
           <w:rFonts w:ascii="Calibri" w:hAnsi="Calibri"/>
         </w:rPr>
+        <w:lastRenderedPageBreak/>
         <w:t>8–15. IP, DATA, CONFIDENTIALITY, TERM, LIABILITY, DISPUTES</w:t>
       </w:r>
     </w:p>
@@ -1155,68 +1073,19 @@
         <w:rPr>
           <w:rFonts w:ascii="Calibri" w:hAnsi="Calibri"/>
         </w:rPr>
-        <w:t>P</w:t>
-      </w:r>
-      <w:r>
-        <w:rPr>
-          <w:rFonts w:ascii="Calibri" w:hAnsi="Calibri"/>
-        </w:rPr>
-        <w:t xml:space="preserve">aid </w:t>
-      </w:r>
-      <w:r>
-        <w:rPr>
-          <w:rFonts w:ascii="Calibri" w:hAnsi="Calibri"/>
-        </w:rPr>
-        <w:t>internship:</w:t>
-      </w:r>
-      <w:r>
-        <w:rPr>
-          <w:rFonts w:ascii="Calibri" w:hAnsi="Calibri"/>
-        </w:rPr>
-        <w:t xml:space="preserve"> </w:t>
-      </w:r>
-      <w:r>
-        <w:rPr>
-          <w:rFonts w:ascii="Calibri" w:hAnsi="Calibri"/>
-        </w:rPr>
-        <w:t>merit-based pathways only.</w:t>
+        <w:t>Arbitration in Coimbatore under Arbitration and Conciliation Act, 1996.</w:t>
       </w:r>
     </w:p>
     <w:p>
       <w:pPr>
         <w:pStyle w:val="ListBullet"/>
-        <w:numPr>
-          <w:ilvl w:val="0"/>
-          <w:numId w:val="0"/>
-        </w:numPr>
-        <w:ind w:left="360" w:hanging="360"/>
+      </w:pPr>
+      <w:r>
         <w:rPr>
           <w:rFonts w:ascii="Calibri" w:hAnsi="Calibri"/>
         </w:rPr>
-      </w:pPr>
-    </w:p>
-    <w:p>
-      <w:pPr>
-        <w:pStyle w:val="ListBullet"/>
-        <w:numPr>
-          <w:ilvl w:val="0"/>
-          <w:numId w:val="0"/>
-        </w:numPr>
-        <w:ind w:left="360" w:hanging="360"/>
-        <w:rPr>
-          <w:rFonts w:ascii="Calibri" w:hAnsi="Calibri"/>
-        </w:rPr>
-      </w:pPr>
-    </w:p>
-    <w:p>
-      <w:pPr>
-        <w:pStyle w:val="ListBullet"/>
-        <w:numPr>
-          <w:ilvl w:val="0"/>
-          <w:numId w:val="0"/>
-        </w:numPr>
-        <w:ind w:left="360" w:hanging="360"/>
-      </w:pPr>
+        <w:t>Placement/internship not guaranteed; merit-based pathways only.</w:t>
+      </w:r>
     </w:p>
     <w:p>
       <w:pPr>
@@ -1226,26 +1095,25 @@
         <w:rPr>
           <w:rFonts w:ascii="Calibri" w:hAnsi="Calibri"/>
         </w:rPr>
-        <w:lastRenderedPageBreak/>
         <w:t>16. CONTACT PERSONS</w:t>
       </w:r>
     </w:p>
     <w:tbl>
       <w:tblPr>
         <w:tblStyle w:val="TableGrid"/>
-        <w:tblW w:w="9464" w:type="dxa"/>
+        <w:tblW w:w="0" w:type="auto"/>
         <w:tblLook w:val="04A0" w:firstRow="1" w:lastRow="0" w:firstColumn="1" w:lastColumn="0" w:noHBand="0" w:noVBand="1"/>
       </w:tblPr>
       <w:tblGrid>
-        <w:gridCol w:w="1319"/>
-        <w:gridCol w:w="2708"/>
-        <w:gridCol w:w="3677"/>
-        <w:gridCol w:w="1760"/>
+        <w:gridCol w:w="1922"/>
+        <w:gridCol w:w="2092"/>
+        <w:gridCol w:w="3205"/>
+        <w:gridCol w:w="2069"/>
       </w:tblGrid>
       <w:tr>
         <w:tc>
           <w:tcPr>
-            <w:tcW w:w="1319" w:type="dxa"/>
+            <w:tcW w:w="2268" w:type="dxa"/>
           </w:tcPr>
           <w:p>
             <w:r>
@@ -1255,7 +1123,7 @@
         </w:tc>
         <w:tc>
           <w:tcPr>
-            <w:tcW w:w="2708" w:type="dxa"/>
+            <w:tcW w:w="2268" w:type="dxa"/>
           </w:tcPr>
           <w:p>
             <w:r>
@@ -1265,7 +1133,7 @@
         </w:tc>
         <w:tc>
           <w:tcPr>
-            <w:tcW w:w="3677" w:type="dxa"/>
+            <w:tcW w:w="2268" w:type="dxa"/>
           </w:tcPr>
           <w:p>
             <w:r>
@@ -1275,7 +1143,7 @@
         </w:tc>
         <w:tc>
           <w:tcPr>
-            <w:tcW w:w="1760" w:type="dxa"/>
+            <w:tcW w:w="2268" w:type="dxa"/>
           </w:tcPr>
           <w:p>
             <w:r>
@@ -1287,7 +1155,7 @@
       <w:tr>
         <w:tc>
           <w:tcPr>
-            <w:tcW w:w="1319" w:type="dxa"/>
+            <w:tcW w:w="2268" w:type="dxa"/>
           </w:tcPr>
           <w:p>
             <w:r>
@@ -1297,49 +1165,31 @@
         </w:tc>
         <w:tc>
           <w:tcPr>
-            <w:tcW w:w="2708" w:type="dxa"/>
+            <w:tcW w:w="2268" w:type="dxa"/>
           </w:tcPr>
           <w:p>
             <w:r>
-              <w:t>Vinodhini Y</w:t>
-            </w:r>
-            <w:r>
-              <w:t xml:space="preserve">, </w:t>
-            </w:r>
-            <w:r>
-              <w:t>Founder</w:t>
+              <w:t>Praveen Manoharan, CTO &amp; TPM</w:t>
             </w:r>
           </w:p>
         </w:tc>
         <w:tc>
           <w:tcPr>
-            <w:tcW w:w="3677" w:type="dxa"/>
+            <w:tcW w:w="2268" w:type="dxa"/>
           </w:tcPr>
           <w:p>
             <w:r>
-              <w:t>admin</w:t>
-            </w:r>
-            <w:r>
-              <w:t>@mantraai</w:t>
-            </w:r>
-            <w:r>
-              <w:t>.cloud</w:t>
+              <w:t>praveen.manoharan@mantra.ai</w:t>
             </w:r>
           </w:p>
         </w:tc>
         <w:tc>
           <w:tcPr>
-            <w:tcW w:w="1760" w:type="dxa"/>
+            <w:tcW w:w="2268" w:type="dxa"/>
           </w:tcPr>
           <w:p>
             <w:r>
-              <w:t>+91</w:t>
-            </w:r>
-            <w:r>
-              <w:t>-</w:t>
-            </w:r>
-            <w:r>
-              <w:t>9940113077</w:t>
+              <w:t>+91 8760 8760 62</w:t>
             </w:r>
           </w:p>
         </w:tc>
@@ -1347,7 +1197,7 @@
       <w:tr>
         <w:tc>
           <w:tcPr>
-            <w:tcW w:w="1319" w:type="dxa"/>
+            <w:tcW w:w="2268" w:type="dxa"/>
           </w:tcPr>
           <w:p>
             <w:r>
@@ -1357,45 +1207,31 @@
         </w:tc>
         <w:tc>
           <w:tcPr>
-            <w:tcW w:w="2708" w:type="dxa"/>
+            <w:tcW w:w="2268" w:type="dxa"/>
           </w:tcPr>
           <w:p>
             <w:r>
-              <w:t xml:space="preserve">Praveen </w:t>
-            </w:r>
-            <w:proofErr w:type="gramStart"/>
-            <w:r>
-              <w:t>Manoharan ,</w:t>
-            </w:r>
-            <w:proofErr w:type="gramEnd"/>
-            <w:r>
-              <w:t xml:space="preserve"> CTO</w:t>
+              <w:t>Official communication (Company)</w:t>
             </w:r>
           </w:p>
         </w:tc>
         <w:tc>
           <w:tcPr>
-            <w:tcW w:w="3677" w:type="dxa"/>
+            <w:tcW w:w="2268" w:type="dxa"/>
           </w:tcPr>
           <w:p>
             <w:r>
-              <w:t>praveenmanoharan</w:t>
-            </w:r>
-            <w:r>
-              <w:t>@mantraai</w:t>
-            </w:r>
-            <w:r>
-              <w:t>.cloud</w:t>
+              <w:t>_________________ @mantra.ai</w:t>
             </w:r>
           </w:p>
         </w:tc>
         <w:tc>
           <w:tcPr>
-            <w:tcW w:w="1760" w:type="dxa"/>
+            <w:tcW w:w="2268" w:type="dxa"/>
           </w:tcPr>
           <w:p>
             <w:r>
-              <w:t>+91 8760876062</w:t>
+              <w:t>—</w:t>
             </w:r>
           </w:p>
         </w:tc>
@@ -1403,7 +1239,7 @@
       <w:tr>
         <w:tc>
           <w:tcPr>
-            <w:tcW w:w="1319" w:type="dxa"/>
+            <w:tcW w:w="2268" w:type="dxa"/>
           </w:tcPr>
           <w:p>
             <w:r>
@@ -1413,37 +1249,39 @@
         </w:tc>
         <w:tc>
           <w:tcPr>
-            <w:tcW w:w="2708" w:type="dxa"/>
+            <w:tcW w:w="2268" w:type="dxa"/>
           </w:tcPr>
           <w:p>
             <w:r>
-              <w:br/>
-            </w:r>
-            <w:r>
-              <w:t>______________________________</w:t>
-            </w:r>
-            <w:r>
-              <w:t>, Principal</w:t>
+              <w:t>Dr. J. Jaya, Principal</w:t>
             </w:r>
           </w:p>
         </w:tc>
         <w:tc>
           <w:tcPr>
-            <w:tcW w:w="3677" w:type="dxa"/>
+            <w:tcW w:w="2268" w:type="dxa"/>
           </w:tcPr>
-          <w:p/>
+          <w:p>
+            <w:r>
+              <w:t>principal@hicet.ac.in</w:t>
+            </w:r>
+          </w:p>
         </w:tc>
         <w:tc>
           <w:tcPr>
-            <w:tcW w:w="1760" w:type="dxa"/>
+            <w:tcW w:w="2268" w:type="dxa"/>
           </w:tcPr>
-          <w:p/>
+          <w:p>
+            <w:r>
+              <w:t>0422-4242424</w:t>
+            </w:r>
+          </w:p>
         </w:tc>
       </w:tr>
       <w:tr>
         <w:tc>
           <w:tcPr>
-            <w:tcW w:w="1319" w:type="dxa"/>
+            <w:tcW w:w="2268" w:type="dxa"/>
           </w:tcPr>
           <w:p>
             <w:r>
@@ -1453,7 +1291,7 @@
         </w:tc>
         <w:tc>
           <w:tcPr>
-            <w:tcW w:w="2708" w:type="dxa"/>
+            <w:tcW w:w="2268" w:type="dxa"/>
           </w:tcPr>
           <w:p>
             <w:r>
@@ -1463,15 +1301,23 @@
         </w:tc>
         <w:tc>
           <w:tcPr>
-            <w:tcW w:w="3677" w:type="dxa"/>
+            <w:tcW w:w="2268" w:type="dxa"/>
           </w:tcPr>
-          <w:p/>
+          <w:p>
+            <w:r>
+              <w:t>_________________ @hicet.ac.in</w:t>
+            </w:r>
+          </w:p>
         </w:tc>
         <w:tc>
           <w:tcPr>
-            <w:tcW w:w="1760" w:type="dxa"/>
+            <w:tcW w:w="2268" w:type="dxa"/>
           </w:tcPr>
-          <w:p/>
+          <w:p>
+            <w:r>
+              <w:t>_________________</w:t>
+            </w:r>
+          </w:p>
         </w:tc>
       </w:tr>
     </w:tbl>
@@ -1500,25 +1346,7 @@
         <w:rPr>
           <w:rFonts w:ascii="Calibri" w:hAnsi="Calibri"/>
         </w:rPr>
-        <w:t>Name: Mr</w:t>
-      </w:r>
-      <w:r>
-        <w:rPr>
-          <w:rFonts w:ascii="Calibri" w:hAnsi="Calibri"/>
-        </w:rPr>
-        <w:t>s</w:t>
-      </w:r>
-      <w:r>
-        <w:rPr>
-          <w:rFonts w:ascii="Calibri" w:hAnsi="Calibri"/>
-        </w:rPr>
-        <w:t xml:space="preserve">. </w:t>
-      </w:r>
-      <w:r>
-        <w:rPr>
-          <w:rFonts w:ascii="Calibri" w:hAnsi="Calibri"/>
-        </w:rPr>
-        <w:t>Vinodhini Y</w:t>
+        <w:t>Name: Mr. Praveen Manoharan</w:t>
       </w:r>
     </w:p>
     <w:p>
@@ -1526,13 +1354,7 @@
         <w:rPr>
           <w:rFonts w:ascii="Calibri" w:hAnsi="Calibri"/>
         </w:rPr>
-        <w:t xml:space="preserve">Designation: </w:t>
-      </w:r>
-      <w:r>
-        <w:rPr>
-          <w:rFonts w:ascii="Calibri" w:hAnsi="Calibri"/>
-        </w:rPr>
-        <w:t>Founder</w:t>
+        <w:t>Designation: CTO &amp; Technical Program Manager</w:t>
       </w:r>
     </w:p>
     <w:p>
@@ -1549,7 +1371,7 @@
         <w:rPr>
           <w:rFonts w:ascii="Calibri" w:hAnsi="Calibri"/>
         </w:rPr>
-        <w:t>FOR HINDUSTHAN COLLEGE OF ENGINEERING (HiCE)</w:t>
+        <w:t>FOR HINDUSTHAN COLLEGE OF ENGINEERING AND TECHNOLOGY (HiCET)</w:t>
       </w:r>
     </w:p>
     <w:p>
@@ -1557,7 +1379,7 @@
         <w:rPr>
           <w:rFonts w:ascii="Calibri" w:hAnsi="Calibri"/>
         </w:rPr>
-        <w:t xml:space="preserve">Name: </w:t>
+        <w:t>Name: Dr. J. Jaya</w:t>
       </w:r>
     </w:p>
     <w:p>
@@ -1565,7 +1387,7 @@
         <w:rPr>
           <w:rFonts w:ascii="Calibri" w:hAnsi="Calibri"/>
         </w:rPr>
-        <w:t xml:space="preserve">Designation: </w:t>
+        <w:t>Designation: Principal</w:t>
       </w:r>
     </w:p>
     <w:p>
@@ -1626,7 +1448,7 @@
           </w:tcPr>
           <w:p>
             <w:r>
-              <w:t>Course Fee</w:t>
+              <w:t>Standard Course Fee</w:t>
             </w:r>
           </w:p>
         </w:tc>
@@ -1637,6 +1459,28 @@
           <w:p>
             <w:r>
               <w:t>₹3,999 per Student</w:t>
+            </w:r>
+          </w:p>
+        </w:tc>
+      </w:tr>
+      <w:tr>
+        <w:tc>
+          <w:tcPr>
+            <w:tcW w:w="4536" w:type="dxa"/>
+          </w:tcPr>
+          <w:p>
+            <w:r>
+              <w:t>Partner Course Fee (10% discount)</w:t>
+            </w:r>
+          </w:p>
+        </w:tc>
+        <w:tc>
+          <w:tcPr>
+            <w:tcW w:w="4536" w:type="dxa"/>
+          </w:tcPr>
+          <w:p>
+            <w:r>
+              <w:t>₹3,599 per Student</w:t>
             </w:r>
           </w:p>
         </w:tc>
@@ -1692,6 +1536,7 @@
           </w:tcPr>
           <w:p>
             <w:r>
+              <w:lastRenderedPageBreak/>
               <w:t>Start date</w:t>
             </w:r>
           </w:p>
@@ -1724,7 +1569,7 @@
           </w:tcPr>
           <w:p>
             <w:r>
-              <w:t xml:space="preserve">Mantra.ai </w:t>
+              <w:t>Option A / Option B</w:t>
             </w:r>
           </w:p>
         </w:tc>
@@ -1744,7 +1589,11 @@
           <w:tcPr>
             <w:tcW w:w="4536" w:type="dxa"/>
           </w:tcPr>
-          <w:p/>
+          <w:p>
+            <w:r>
+              <w:t>Name: __________ Email: __________ @hicet.ac.in</w:t>
+            </w:r>
+          </w:p>
         </w:tc>
       </w:tr>
       <w:tr>
@@ -1762,7 +1611,11 @@
           <w:tcPr>
             <w:tcW w:w="4536" w:type="dxa"/>
           </w:tcPr>
-          <w:p/>
+          <w:p>
+            <w:r>
+              <w:t>Name: __________ Email: __________</w:t>
+            </w:r>
+          </w:p>
         </w:tc>
       </w:tr>
       <w:tr>
@@ -1782,43 +1635,23 @@
           </w:tcPr>
           <w:p>
             <w:r>
-              <w:t>admin</w:t>
-            </w:r>
-            <w:r>
-              <w:t>@mantraai</w:t>
-            </w:r>
-            <w:r>
-              <w:t>.cloud</w:t>
+              <w:t>__________ @mantra.ai (Clause 5.3)</w:t>
             </w:r>
           </w:p>
-        </w:tc>
-      </w:tr>
-      <w:tr>
-        <w:tc>
-          <w:tcPr>
-            <w:tcW w:w="4536" w:type="dxa"/>
-          </w:tcPr>
-          <w:p/>
-        </w:tc>
-        <w:tc>
-          <w:tcPr>
-            <w:tcW w:w="4536" w:type="dxa"/>
-          </w:tcPr>
-          <w:p/>
         </w:tc>
       </w:tr>
     </w:tbl>
     <w:p/>
     <w:p>
       <w:pPr>
-        <w:ind w:left="2160" w:firstLine="720"/>
+        <w:jc w:val="center"/>
       </w:pPr>
       <w:r>
         <w:rPr>
           <w:rFonts w:ascii="Calibri" w:hAnsi="Calibri"/>
           <w:sz w:val="18"/>
         </w:rPr>
-        <w:t xml:space="preserve"> Mantra.ai · Draft MoU · June 2026</w:t>
+        <w:t>Proprietary — Mantra.ai · Draft MoU · June 2026</w:t>
       </w:r>
     </w:p>
     <w:sectPr>
@@ -2004,31 +1837,31 @@
       </w:rPr>
     </w:lvl>
   </w:abstractNum>
-  <w:num w:numId="1" w16cid:durableId="1435980666">
+  <w:num w:numId="1" w16cid:durableId="1960335486">
     <w:abstractNumId w:val="8"/>
   </w:num>
-  <w:num w:numId="2" w16cid:durableId="820000406">
+  <w:num w:numId="2" w16cid:durableId="895513259">
     <w:abstractNumId w:val="6"/>
   </w:num>
-  <w:num w:numId="3" w16cid:durableId="476143623">
+  <w:num w:numId="3" w16cid:durableId="1217157334">
     <w:abstractNumId w:val="5"/>
   </w:num>
-  <w:num w:numId="4" w16cid:durableId="170918037">
+  <w:num w:numId="4" w16cid:durableId="52244681">
     <w:abstractNumId w:val="4"/>
   </w:num>
-  <w:num w:numId="5" w16cid:durableId="1331639733">
+  <w:num w:numId="5" w16cid:durableId="1760783972">
     <w:abstractNumId w:val="7"/>
   </w:num>
-  <w:num w:numId="6" w16cid:durableId="1479344845">
+  <w:num w:numId="6" w16cid:durableId="1331786105">
     <w:abstractNumId w:val="3"/>
   </w:num>
-  <w:num w:numId="7" w16cid:durableId="1521119054">
+  <w:num w:numId="7" w16cid:durableId="1206603323">
     <w:abstractNumId w:val="2"/>
   </w:num>
-  <w:num w:numId="8" w16cid:durableId="783422016">
+  <w:num w:numId="8" w16cid:durableId="1652248318">
     <w:abstractNumId w:val="1"/>
   </w:num>
-  <w:num w:numId="9" w16cid:durableId="2062094703">
+  <w:num w:numId="9" w16cid:durableId="1145317033">
     <w:abstractNumId w:val="0"/>
   </w:num>
 </w:numbering>

</xml_diff>